<commit_message>
cv: reframe headline to autonomous-AI-agents specialization
Lead with the rare/in-demand positioning (autonomous KI agents + harness/
infrastructure); keep Data Analyst · ML · Fullstack as keywords one line down
for recruiter search. Regenerated PDF + DOCX.
</commit_message>
<xml_diff>
--- a/cv.docx
+++ b/cv.docx
@@ -24,7 +24,7 @@
           <w:color w:val="0D5C54"/>
           <w:sz w:val="24"/>
         </w:rPr>
-        <w:t>Fullstack · Data Analyst · ML · Harness &amp; Agentic Engineering</w:t>
+        <w:t>Full-Stack-Entwickler mit Spezialisierung auf autonome KI-Agenten und deren Infrastruktur</w:t>
       </w:r>
     </w:p>
     <w:p>
@@ -36,7 +36,7 @@
           <w:color w:val="555555"/>
           <w:sz w:val="20"/>
         </w:rPr>
-        <w:t>Java · Python · LLM-Agenten / Claude · Vue 3 · Spring Boot · Docker</w:t>
+        <w:t>Harness &amp; Agentic Engineering · Data Analyst · ML · Fullstack · Java · Python · LLM-Agenten / Claude · Vue 3 · Spring Boot · Docker</w:t>
       </w:r>
     </w:p>
     <w:p>

</xml_diff>

<commit_message>
Availability 15.09.2026; expand the harness engineering content
Jens 16:56: available from 15.09.2026, and build out the harness engineer
side. Flagship project and the English FDE variant now name the harness
parts one by one (loop + stop conditions, MCP tool use, layered memory,
approval gates, quality gates, observability, budget/rate-limit control
with model routing and fallback, recovery after a killed run, local
multi-model proxy) instead of listing four of them.

Availability assertions read konditionen.csv instead of a literal - the
literal is what made the old date survive a data fix.
</commit_message>
<xml_diff>
--- a/cv.docx
+++ b/cv.docx
@@ -25,7 +25,7 @@
     </w:p>
     <w:p>
       <w:r>
-        <w:t>Verfügbar sofort · weltweit · Remote 95 % ·  remote /  vor Ort</w:t>
+        <w:t>Verfügbar ab 15.09.2026 · weltweit · Remote 95 % ·  remote /  vor Ort</w:t>
       </w:r>
     </w:p>
     <w:p>
@@ -242,7 +242,7 @@
     </w:p>
     <w:p>
       <w:r>
-        <w:t>Aufbau autonomer KI-Agenten-Systeme auf LLM-Basis als Harness Engineer: das Gerüst um das Modell — Agenten-Loop, Tool-Use / MCP, Freigabe-Gates, Memory, Observability und Budget-Steuerung — nicht das Modell selbst. Zwei produktive Systeme: ein selbststeuernder KI-Geschäftspartner, der rund um die Uhr plant, Code schreibt, testet und deployt, sowie Fabrik ([fabrikhq.com](https://fabrikhq.com)), eine Multi-Agenten-Plattform für autonome Softwareentwicklung mit parallelen Worker-Agenten. Ereignisgesteuerte Orchestrierung über Telegram, GitHub und systemd; mehrere KI-gebaute SaaS-Produkte end-to-end ausgeliefert.</w:t>
+        <w:t>Aufbau autonomer KI-Agenten-Systeme auf LLM-Basis als Harness Engineer — die Ingenieursarbeit um das Modell herum, nicht das Modell selbst. Das Harness ist das Produkt: Agenten-Loop mit Abbruchbedingungen, Tool-Use über MCP, geschichtetes Memory (dauerhafte Fakten, laufender Kontext, Session-Zustand), Freigabe-Gates vor allem Unumkehrbaren, Quality Gates, die grün sein müssen, bevor ein Agent ausliefern darf, Observability über jeden Lauf, Budget- und Rate-Limit-Steuerung mit Modell-Routing und Fallback sowie Wiederaufsetzen nach einem abgebrochenen Lauf. Ein lokaler Multi-Modell-Proxy hält das Ganze unabhängig von einem einzelnen Anbieter. Zwei produktive Systeme: ein selbststeuernder KI-Geschäftspartner, der rund um die Uhr plant, Code schreibt, testet und deployt, sowie Fabrik ([fabrikhq.com](https://fabrikhq.com)), eine Multi-Agenten-Plattform für autonome Softwareentwicklung mit parallelen Worker-Agenten. Ereignisgesteuerte Orchestrierung über Telegram, GitHub und systemd; mehrere KI-gebaute SaaS-Produkte end-to-end ausgeliefert.</w:t>
       </w:r>
     </w:p>
     <w:p>

</xml_diff>